<commit_message>
Lever compacte browserdata voor Meijendel-dashboard
</commit_message>
<xml_diff>
--- a/MDs/output.docx
+++ b/MDs/output.docx
@@ -1382,16 +1382,7 @@
         </w:numPr>
       </w:pPr>
       <w:r>
-        <w:t xml:space="preserve">laad</w:t>
-      </w:r>
-      <w:r>
-        <w:t xml:space="preserve"> </w:t>
-      </w:r>
-      <w:r>
-        <w:rPr>
-          <w:rStyle w:val="VerbatimChar"/>
-        </w:rPr>
-        <w:t xml:space="preserve">Meijendel.sql</w:t>
+        <w:t>wacht tot de compacte, hashgebonden dashboarddata automatisch is geladen</w:t>
       </w:r>
     </w:p>
     <w:p>
@@ -1403,7 +1394,7 @@
         </w:numPr>
       </w:pPr>
       <w:r>
-        <w:t xml:space="preserve">laad waar nodig extra CSV-bestanden</w:t>
+        <w:t>gebruik de filters; de aanvullende CSV-bestanden worden eveneens automatisch geladen</w:t>
       </w:r>
     </w:p>
     <w:p>
@@ -2587,16 +2578,7 @@
         </w:numPr>
       </w:pPr>
       <w:r>
-        <w:t xml:space="preserve">rechtstreeks uit</w:t>
-      </w:r>
-      <w:r>
-        <w:t xml:space="preserve"> </w:t>
-      </w:r>
-      <w:r>
-        <w:rPr>
-          <w:rStyle w:val="VerbatimChar"/>
-        </w:rPr>
-        <w:t xml:space="preserve">Meijendel.sql</w:t>
+        <w:t>de compacte dashboarddataset die bij iedere release uit de gevalideerde, inhoudsgebonden cache van Meijendel.sql wordt gemaakt</w:t>
       </w:r>
     </w:p>
     <w:bookmarkEnd w:id="25"/>

</xml_diff>